<commit_message>
Add kawaii 7-slide business plan deck for Murchalka cat cafe
- Strawberry-milk style deck: title art from the presenter's photo,
  startup items, monthly costs, average check and guests per day,
  cumulative profit to payback, summary
- Generated art cut out to transparent PNG stickers (assets/)
- Native charts driven by src/numbers.js; PDF export with embedded
  Nunito font, plus the font files for PowerPoint
- Word speech notes now match the final slide titles

Co-Authored-By: Claude Opus 5.5 <noreply@anthropic.com>
Claude-Session: https://claude.ai/code/session_01LLs5Qii2U2qSS7AGeGPKzv
</commit_message>
<xml_diff>
--- a/Мурчалка_текст_выступления.docx
+++ b/Мурчалка_текст_выступления.docx
@@ -745,7 +745,7 @@
           <w:iCs/>
           <w:color w:val="8A7474"/>
         </w:rPr>
-        <w:t xml:space="preserve">Название «Мурчалка», слоган, большой котик.</w:t>
+        <w:t xml:space="preserve">Название «Мурчалка» и арт: вы с котиком и кофе.</w:t>
       </w:r>
       <w:r>
         <w:rPr>
@@ -1011,7 +1011,7 @@
         <w:pStyle w:val="Heading2"/>
       </w:pPr>
       <w:r>
-        <w:t xml:space="preserve">Слайд 3 · Стартовый капитал</w:t>
+        <w:t xml:space="preserve">Слайд 3 · Что нужно для старта</w:t>
       </w:r>
     </w:p>
     <w:p>
@@ -1032,7 +1032,7 @@
           <w:iCs/>
           <w:color w:val="8A7474"/>
         </w:rPr>
-        <w:t xml:space="preserve">Кольцевая диаграмма 4,5 млн ₽ и полоска «свои 60% / кредит 40%».</w:t>
+        <w:t xml:space="preserve">Пять карточек-картинок: что покупаем и сколько это стоит; полоска долей; «Всего 4,5 млн ₽».</w:t>
       </w:r>
       <w:r>
         <w:rPr>
@@ -1426,7 +1426,7 @@
         <w:pStyle w:val="Heading2"/>
       </w:pPr>
       <w:r>
-        <w:t xml:space="preserve">Слайд 5 · Доходы</w:t>
+        <w:t xml:space="preserve">Слайд 5 · Откуда деньги</w:t>
       </w:r>
     </w:p>
     <w:p>
@@ -1447,7 +1447,7 @@
           <w:iCs/>
           <w:color w:val="8A7474"/>
         </w:rPr>
-        <w:t xml:space="preserve">Средний чек 950 ₽ (500 + 380 + 70), график гостей в день, линия безубыточности.</w:t>
+        <w:t xml:space="preserve">Средний чек 950 ₽ и график гостей в день: розовые месяцы — убыток, зелёные — прибыль, пунктир — 36 гостей.</w:t>
       </w:r>
       <w:r>
         <w:rPr>
@@ -1652,7 +1652,7 @@
           <w:iCs/>
           <w:color w:val="8A7474"/>
         </w:rPr>
-        <w:t xml:space="preserve">График накопленной прибыли: 4-й месяц — первая прибыль, 17-й — окупаемость.</w:t>
+        <w:t xml:space="preserve">График «сколько заработали с начала»: розовые столбики — ещё в минусе, зелёные — вложения вернулись. Карточки «4-й месяц» и «17-й месяц».</w:t>
       </w:r>
       <w:r>
         <w:rPr>
@@ -1857,7 +1857,7 @@
           <w:iCs/>
           <w:color w:val="8A7474"/>
         </w:rPr>
-        <w:t xml:space="preserve">Четыре большие цифры и котик «Спасибо!».</w:t>
+        <w:t xml:space="preserve">Четыре главные цифры, «Спасибо за внимание!» и ваш портрет.</w:t>
       </w:r>
       <w:r>
         <w:rPr>

</xml_diff>

<commit_message>
Switch business plan to Uzbek sums with Tashkent-based figures
- Re-plan capital (550 mln sum), monthly costs (84 mln sum) and
  average check (100 000 sum) for Tashkent prices instead of a
  plain RUB conversion; payback moves to month 19
- Shared sum formatter (src/format.js) used by the deck and Word file
- Speaker notes, Q&A and tables are now generated from numbers.js

Co-Authored-By: Claude Opus 5.5 <noreply@anthropic.com>
Claude-Session: https://claude.ai/code/session_01LLs5Qii2U2qSS7AGeGPKzv
</commit_message>
<xml_diff>
--- a/Мурчалка_текст_выступления.docx
+++ b/Мурчалка_текст_выступления.docx
@@ -260,7 +260,7 @@
                 <w:sz w:val="20"/>
                 <w:szCs w:val="20"/>
               </w:rPr>
-              <w:t xml:space="preserve">4 500 000 ₽</w:t>
+              <w:t xml:space="preserve">550 млн сум</w:t>
             </w:r>
           </w:p>
         </w:tc>
@@ -370,7 +370,7 @@
                 <w:sz w:val="20"/>
                 <w:szCs w:val="20"/>
               </w:rPr>
-              <w:t xml:space="preserve">765 000 ₽</w:t>
+              <w:t xml:space="preserve">84 млн сум</w:t>
             </w:r>
           </w:p>
         </w:tc>
@@ -426,7 +426,7 @@
                 <w:sz w:val="20"/>
                 <w:szCs w:val="20"/>
               </w:rPr>
-              <w:t xml:space="preserve">950 ₽</w:t>
+              <w:t xml:space="preserve">100 000 сум</w:t>
             </w:r>
           </w:p>
         </w:tc>
@@ -480,7 +480,7 @@
                 <w:sz w:val="20"/>
                 <w:szCs w:val="20"/>
               </w:rPr>
-              <w:t xml:space="preserve">36 гостей в день</w:t>
+              <w:t xml:space="preserve">37 гостей в день</w:t>
             </w:r>
           </w:p>
         </w:tc>
@@ -590,7 +590,7 @@
                 <w:sz w:val="20"/>
                 <w:szCs w:val="20"/>
               </w:rPr>
-              <w:t xml:space="preserve">15 млн ₽ / 2,2 млн ₽</w:t>
+              <w:t xml:space="preserve">1,6 млрд сум / 194 млн сум</w:t>
             </w:r>
           </w:p>
         </w:tc>
@@ -646,7 +646,7 @@
                 <w:sz w:val="20"/>
                 <w:szCs w:val="20"/>
               </w:rPr>
-              <w:t xml:space="preserve">17-й месяц (май 2028)</w:t>
+              <w:t xml:space="preserve">19-й месяц (июль 2028)</w:t>
             </w:r>
           </w:p>
         </w:tc>
@@ -700,7 +700,7 @@
                 <w:sz w:val="20"/>
                 <w:szCs w:val="20"/>
               </w:rPr>
-              <w:t xml:space="preserve">6,4 млн ₽</w:t>
+              <w:t xml:space="preserve">634 млн сум</w:t>
             </w:r>
           </w:p>
         </w:tc>
@@ -855,7 +855,7 @@
           <w:iCs/>
           <w:color w:val="8A7474"/>
         </w:rPr>
-        <w:t xml:space="preserve">Четыре плитки: 120 м², 30 мест, 8 котиков, 11:00–22:00. Три источника дохода.</w:t>
+        <w:t xml:space="preserve">Кафе-диорама и четыре плитки: 120 м², 30 мест, 8 котиков, 11–22. Три источника дохода.</w:t>
       </w:r>
       <w:r>
         <w:rPr>
@@ -1032,7 +1032,7 @@
           <w:iCs/>
           <w:color w:val="8A7474"/>
         </w:rPr>
-        <w:t xml:space="preserve">Пять карточек-картинок: что покупаем и сколько это стоит; полоска долей; «Всего 4,5 млн ₽».</w:t>
+        <w:t xml:space="preserve">Пять карточек-картинок: что покупаем и сколько это стоит; полоска долей; «Всего 550 млн сум».</w:t>
       </w:r>
       <w:r>
         <w:rPr>
@@ -1059,13 +1059,13 @@
           <w:bCs/>
           <w:color w:val="D9467A"/>
         </w:rPr>
-        <w:t xml:space="preserve">4,5 млн ₽</w:t>
+        <w:t xml:space="preserve">550 млн сум</w:t>
       </w:r>
       <w:r>
         <w:rPr>
           <w:color w:val="5B3A3A"/>
         </w:rPr>
-        <w:t xml:space="preserve">.</w:t>
+        <w:t xml:space="preserve">. На слайде видно, на что они пойдут.</w:t>
       </w:r>
     </w:p>
     <w:p>
@@ -1076,7 +1076,7 @@
         <w:rPr>
           <w:color w:val="5B3A3A"/>
         </w:rPr>
-        <w:t xml:space="preserve">Самая большая часть — </w:t>
+        <w:t xml:space="preserve">Больше всего — </w:t>
       </w:r>
       <w:r>
         <w:rPr>
@@ -1084,7 +1084,7 @@
           <w:bCs/>
           <w:color w:val="D9467A"/>
         </w:rPr>
-        <w:t xml:space="preserve">1,8 млн</w:t>
+        <w:t xml:space="preserve">220 млн</w:t>
       </w:r>
       <w:r>
         <w:rPr>
@@ -1098,13 +1098,13 @@
           <w:bCs/>
           <w:color w:val="D9467A"/>
         </w:rPr>
-        <w:t xml:space="preserve">700 тысяч</w:t>
+        <w:t xml:space="preserve">115 млн</w:t>
       </w:r>
       <w:r>
         <w:rPr>
           <w:color w:val="5B3A3A"/>
         </w:rPr>
-        <w:t xml:space="preserve"> — кухня и кофемашина. </w:t>
+        <w:t xml:space="preserve"> — запуск: залог за аренду, первые закупки, реклама к открытию и документы. </w:t>
       </w:r>
       <w:r>
         <w:rPr>
@@ -1112,13 +1112,13 @@
           <w:bCs/>
           <w:color w:val="D9467A"/>
         </w:rPr>
-        <w:t xml:space="preserve">950 тысяч</w:t>
+        <w:t xml:space="preserve">90 млн</w:t>
       </w:r>
       <w:r>
         <w:rPr>
           <w:color w:val="5B3A3A"/>
         </w:rPr>
-        <w:t xml:space="preserve"> — запуск: залог за аренду, первые закупки, реклама к открытию и документы. </w:t>
+        <w:t xml:space="preserve"> — кухня и кофемашина. </w:t>
       </w:r>
       <w:r>
         <w:rPr>
@@ -1126,7 +1126,7 @@
           <w:bCs/>
           <w:color w:val="D9467A"/>
         </w:rPr>
-        <w:t xml:space="preserve">250 тысяч</w:t>
+        <w:t xml:space="preserve">25 млн</w:t>
       </w:r>
       <w:r>
         <w:rPr>
@@ -1151,7 +1151,7 @@
           <w:bCs/>
           <w:color w:val="D9467A"/>
         </w:rPr>
-        <w:t xml:space="preserve">800 тысяч</w:t>
+        <w:t xml:space="preserve">100 млн</w:t>
       </w:r>
       <w:r>
         <w:rPr>
@@ -1233,7 +1233,7 @@
               <w:rPr>
                 <w:color w:val="5B3A3A"/>
               </w:rPr>
-              <w:t xml:space="preserve">4,5 млн = 1,8 ремонт + 0,95 запуск + 0,8 подушка + 0,7 кухня + 0,25 котики; 60/40.</w:t>
+              <w:t xml:space="preserve">550 млн = 220 млн ремонт + 115 млн запуск + 100 млн подушка + 90 млн кухня + 25 млн котики; 60/40.</w:t>
             </w:r>
           </w:p>
         </w:tc>
@@ -1270,7 +1270,7 @@
           <w:iCs/>
           <w:color w:val="8A7474"/>
         </w:rPr>
-        <w:t xml:space="preserve">Большая цифра 765 тыс. ₽ и столбики по статьям.</w:t>
+        <w:t xml:space="preserve">Котик с чеком, большая цифра 84 млн сум и столбики по статьям.</w:t>
       </w:r>
       <w:r>
         <w:rPr>
@@ -1297,7 +1297,7 @@
           <w:bCs/>
           <w:color w:val="D9467A"/>
         </w:rPr>
-        <w:t xml:space="preserve">765 тыс. ₽</w:t>
+        <w:t xml:space="preserve">84 млн сум</w:t>
       </w:r>
       <w:r>
         <w:rPr>
@@ -1314,7 +1314,7 @@
         <w:rPr>
           <w:color w:val="5B3A3A"/>
         </w:rPr>
-        <w:t xml:space="preserve">Больше половины — </w:t>
+        <w:t xml:space="preserve">Больше всего — </w:t>
       </w:r>
       <w:r>
         <w:rPr>
@@ -1322,7 +1322,7 @@
           <w:bCs/>
           <w:color w:val="D9467A"/>
         </w:rPr>
-        <w:t xml:space="preserve">420 тысяч</w:t>
+        <w:t xml:space="preserve">36 млн</w:t>
       </w:r>
       <w:r>
         <w:rPr>
@@ -1336,13 +1336,13 @@
           <w:bCs/>
           <w:color w:val="D9467A"/>
         </w:rPr>
-        <w:t xml:space="preserve">150 тысяч</w:t>
+        <w:t xml:space="preserve">24 млн</w:t>
       </w:r>
       <w:r>
         <w:rPr>
           <w:color w:val="5B3A3A"/>
         </w:rPr>
-        <w:t xml:space="preserve">. Остальное — реклама, коммунальные услуги, уход за котиками, проценты по кредиту и мелкие расходы.</w:t>
+        <w:t xml:space="preserve">. Остальное — реклама в Instagram и Telegram, коммунальные услуги, уход за котиками, проценты по кредиту и мелкие расходы.</w:t>
       </w:r>
     </w:p>
     <w:p>
@@ -1353,7 +1353,7 @@
         <w:rPr>
           <w:color w:val="5B3A3A"/>
         </w:rPr>
-        <w:t xml:space="preserve">Ещё есть расходы, которые растут вместе с продажами: продукты, мерч и налог — примерно </w:t>
+        <w:t xml:space="preserve">Ещё есть расходы, которые растут вместе с продажами: продукты, мерч и налоги — примерно </w:t>
       </w:r>
       <w:r>
         <w:rPr>
@@ -1361,13 +1361,13 @@
           <w:bCs/>
           <w:color w:val="D9467A"/>
         </w:rPr>
-        <w:t xml:space="preserve">24 копейки</w:t>
+        <w:t xml:space="preserve">24%</w:t>
       </w:r>
       <w:r>
         <w:rPr>
           <w:color w:val="5B3A3A"/>
         </w:rPr>
-        <w:t xml:space="preserve"> с каждого заработанного рубля.</w:t>
+        <w:t xml:space="preserve">, то есть почти четверть от каждой продажи.</w:t>
       </w:r>
     </w:p>
     <w:tbl>
@@ -1410,7 +1410,7 @@
               <w:rPr>
                 <w:color w:val="5B3A3A"/>
               </w:rPr>
-              <w:t xml:space="preserve">765 тыс./мес: зарплата 420, аренда 150; плюс 24% от выручки.</w:t>
+              <w:t xml:space="preserve">84 млн сум/мес: зарплата 36 млн, аренда 24 млн; плюс 24% от выручки.</w:t>
             </w:r>
           </w:p>
         </w:tc>
@@ -1447,7 +1447,7 @@
           <w:iCs/>
           <w:color w:val="8A7474"/>
         </w:rPr>
-        <w:t xml:space="preserve">Средний чек 950 ₽ и график гостей в день: розовые месяцы — убыток, зелёные — прибыль, пунктир — 36 гостей.</w:t>
+        <w:t xml:space="preserve">Средний чек 100 000 сум и график гостей в день: розовые месяцы — убыток, зелёные — прибыль, пунктир — 37 гостей.</w:t>
       </w:r>
       <w:r>
         <w:rPr>
@@ -1474,13 +1474,13 @@
           <w:bCs/>
           <w:color w:val="D9467A"/>
         </w:rPr>
-        <w:t xml:space="preserve">950 ₽</w:t>
+        <w:t xml:space="preserve">100 000 сум</w:t>
       </w:r>
       <w:r>
         <w:rPr>
           <w:color w:val="5B3A3A"/>
         </w:rPr>
-        <w:t xml:space="preserve">: 500 рублей за время с котиками — час стоит 400 рублей, и в среднем гость остаётся на час с четвертью, — 380 рублей на напитки и десерты и 70 рублей на мерч.</w:t>
+        <w:t xml:space="preserve">: 50 000 сум за время с котиками — час стоит 40 000 сум, и в среднем гость остаётся на час с четвертью, — 42 000 сум на напитки и десерты и 8 000 сум на мерч.</w:t>
       </w:r>
     </w:p>
     <w:p>
@@ -1491,7 +1491,7 @@
         <w:rPr>
           <w:color w:val="5B3A3A"/>
         </w:rPr>
-        <w:t xml:space="preserve">С каждого гостя после продуктов и налога у нас остаётся около </w:t>
+        <w:t xml:space="preserve">С каждого гостя после продуктов и налогов у нас остаётся около </w:t>
       </w:r>
       <w:r>
         <w:rPr>
@@ -1499,7 +1499,7 @@
           <w:bCs/>
           <w:color w:val="D9467A"/>
         </w:rPr>
-        <w:t xml:space="preserve">722 ₽</w:t>
+        <w:t xml:space="preserve">76 000 сум</w:t>
       </w:r>
       <w:r>
         <w:rPr>
@@ -1513,7 +1513,7 @@
           <w:bCs/>
           <w:color w:val="D9467A"/>
         </w:rPr>
-        <w:t xml:space="preserve">36 гостей в день</w:t>
+        <w:t xml:space="preserve">37 гостей в день</w:t>
       </w:r>
       <w:r>
         <w:rPr>
@@ -1615,7 +1615,7 @@
               <w:rPr>
                 <w:color w:val="5B3A3A"/>
               </w:rPr>
-              <w:t xml:space="preserve">чек 950 ₽ = 500 + 380 + 70; с гостя остаётся 722 ₽; безубыточность — 36 гостей/день.</w:t>
+              <w:t xml:space="preserve">чек 100 тыс. = 50 тыс. + 42 тыс. + 8 тыс.; с гостя остаётся 76 тыс.; безубыточность — 37 гостей/день.</w:t>
             </w:r>
           </w:p>
         </w:tc>
@@ -1652,7 +1652,7 @@
           <w:iCs/>
           <w:color w:val="8A7474"/>
         </w:rPr>
-        <w:t xml:space="preserve">График «сколько заработали с начала»: розовые столбики — ещё в минусе, зелёные — вложения вернулись. Карточки «4-й месяц» и «17-й месяц».</w:t>
+        <w:t xml:space="preserve">График «сколько заработали с начала»: розовые столбики — ещё в минусе, зелёные — вложения вернулись. Карточки «4-й месяц» и «19-й месяц».</w:t>
       </w:r>
       <w:r>
         <w:rPr>
@@ -1679,7 +1679,7 @@
           <w:bCs/>
           <w:color w:val="D9467A"/>
         </w:rPr>
-        <w:t xml:space="preserve">605 тысяч</w:t>
+        <w:t xml:space="preserve">74 млн сум</w:t>
       </w:r>
       <w:r>
         <w:rPr>
@@ -1718,7 +1718,7 @@
           <w:bCs/>
           <w:color w:val="D9467A"/>
         </w:rPr>
-        <w:t xml:space="preserve">15 млн ₽</w:t>
+        <w:t xml:space="preserve">1,6 млрд сум</w:t>
       </w:r>
       <w:r>
         <w:rPr>
@@ -1732,7 +1732,7 @@
           <w:bCs/>
           <w:color w:val="D9467A"/>
         </w:rPr>
-        <w:t xml:space="preserve">2,2 млн ₽</w:t>
+        <w:t xml:space="preserve">194 млн сум</w:t>
       </w:r>
       <w:r>
         <w:rPr>
@@ -1757,13 +1757,13 @@
           <w:bCs/>
           <w:color w:val="D9467A"/>
         </w:rPr>
-        <w:t xml:space="preserve">17-м месяце</w:t>
+        <w:t xml:space="preserve">19-м месяце</w:t>
       </w:r>
       <w:r>
         <w:rPr>
           <w:color w:val="5B3A3A"/>
         </w:rPr>
-        <w:t xml:space="preserve">, то есть примерно через полтора года, кафе полностью вернёт все вложенные 4,5 млн ₽. Дальше — чистая прибыль около </w:t>
+        <w:t xml:space="preserve"> — чуть больше чем через полтора года — кафе полностью вернёт все вложенные 550 млн сум. Дальше — чистая прибыль около </w:t>
       </w:r>
       <w:r>
         <w:rPr>
@@ -1771,7 +1771,7 @@
           <w:bCs/>
           <w:color w:val="D9467A"/>
         </w:rPr>
-        <w:t xml:space="preserve">535 тыс. ₽</w:t>
+        <w:t xml:space="preserve">52,8 млн сум</w:t>
       </w:r>
       <w:r>
         <w:rPr>
@@ -1820,7 +1820,7 @@
               <w:rPr>
                 <w:color w:val="5B3A3A"/>
               </w:rPr>
-              <w:t xml:space="preserve">убыток 3 мес. ≈ 605 тыс. (покрывает подушка); плюс с 4-го месяца; окупаемость — 17-й месяц.</w:t>
+              <w:t xml:space="preserve">убыток 3 мес. ≈ 74 млн (покрывает подушка); плюс с 4-го месяца; окупаемость — 19-й месяц.</w:t>
             </w:r>
           </w:p>
         </w:tc>
@@ -1884,7 +1884,7 @@
           <w:bCs/>
           <w:color w:val="D9467A"/>
         </w:rPr>
-        <w:t xml:space="preserve">4,5 млн ₽</w:t>
+        <w:t xml:space="preserve">550 млн сум</w:t>
       </w:r>
       <w:r>
         <w:rPr>
@@ -1912,7 +1912,7 @@
           <w:bCs/>
           <w:color w:val="D9467A"/>
         </w:rPr>
-        <w:t xml:space="preserve">17 месяцев</w:t>
+        <w:t xml:space="preserve">19 месяцев</w:t>
       </w:r>
       <w:r>
         <w:rPr>
@@ -1926,7 +1926,7 @@
           <w:bCs/>
           <w:color w:val="D9467A"/>
         </w:rPr>
-        <w:t xml:space="preserve">6,4 млн ₽</w:t>
+        <w:t xml:space="preserve">634 млн сум</w:t>
       </w:r>
       <w:r>
         <w:rPr>
@@ -1986,7 +1986,7 @@
               <w:rPr>
                 <w:color w:val="5B3A3A"/>
               </w:rPr>
-              <w:t xml:space="preserve">4,5 млн → прибыль с 4-го месяца → окупаемость 17 мес. → 6,4 млн во 2-й год.</w:t>
+              <w:t xml:space="preserve">550 млн → прибыль с 4-го месяца → окупаемость 19 мес. → 634 млн во 2-й год.</w:t>
             </w:r>
           </w:p>
         </w:tc>
@@ -2015,7 +2015,7 @@
         <w:spacing w:after="120" w:line="300"/>
       </w:pPr>
       <w:r>
-        <w:t xml:space="preserve">Это не нужно рассказывать — но полезно знать, если спросят «а откуда эта цифра?».</w:t>
+        <w:t xml:space="preserve">Это не нужно рассказывать — но полезно знать, если спросят «а откуда эта цифра?». Все суммы — в узбекских сумах, цены и зарплаты — ориентир Ташкент, открытие в январе 2027 года.</w:t>
       </w:r>
     </w:p>
     <w:p>
@@ -2151,7 +2151,7 @@
                 <w:sz w:val="20"/>
                 <w:szCs w:val="20"/>
               </w:rPr>
-              <w:t xml:space="preserve">1 200 000 ₽</w:t>
+              <w:t xml:space="preserve">150 000 000 сум</w:t>
             </w:r>
           </w:p>
         </w:tc>
@@ -2207,7 +2207,7 @@
                 <w:sz w:val="20"/>
                 <w:szCs w:val="20"/>
               </w:rPr>
-              <w:t xml:space="preserve">600 000 ₽</w:t>
+              <w:t xml:space="preserve">70 000 000 сум</w:t>
             </w:r>
           </w:p>
         </w:tc>
@@ -2261,7 +2261,7 @@
                 <w:sz w:val="20"/>
                 <w:szCs w:val="20"/>
               </w:rPr>
-              <w:t xml:space="preserve">700 000 ₽</w:t>
+              <w:t xml:space="preserve">90 000 000 сум</w:t>
             </w:r>
           </w:p>
         </w:tc>
@@ -2317,7 +2317,7 @@
                 <w:sz w:val="20"/>
                 <w:szCs w:val="20"/>
               </w:rPr>
-              <w:t xml:space="preserve">300 000 ₽</w:t>
+              <w:t xml:space="preserve">50 000 000 сум</w:t>
             </w:r>
           </w:p>
         </w:tc>
@@ -2371,7 +2371,7 @@
                 <w:sz w:val="20"/>
                 <w:szCs w:val="20"/>
               </w:rPr>
-              <w:t xml:space="preserve">300 000 ₽</w:t>
+              <w:t xml:space="preserve">30 000 000 сум</w:t>
             </w:r>
           </w:p>
         </w:tc>
@@ -2427,7 +2427,7 @@
                 <w:sz w:val="20"/>
                 <w:szCs w:val="20"/>
               </w:rPr>
-              <w:t xml:space="preserve">200 000 ₽</w:t>
+              <w:t xml:space="preserve">20 000 000 сум</w:t>
             </w:r>
           </w:p>
         </w:tc>
@@ -2481,7 +2481,7 @@
                 <w:sz w:val="20"/>
                 <w:szCs w:val="20"/>
               </w:rPr>
-              <w:t xml:space="preserve">150 000 ₽</w:t>
+              <w:t xml:space="preserve">15 000 000 сум</w:t>
             </w:r>
           </w:p>
         </w:tc>
@@ -2537,7 +2537,7 @@
                 <w:sz w:val="20"/>
                 <w:szCs w:val="20"/>
               </w:rPr>
-              <w:t xml:space="preserve">250 000 ₽</w:t>
+              <w:t xml:space="preserve">25 000 000 сум</w:t>
             </w:r>
           </w:p>
         </w:tc>
@@ -2591,7 +2591,7 @@
                 <w:sz w:val="20"/>
                 <w:szCs w:val="20"/>
               </w:rPr>
-              <w:t xml:space="preserve">800 000 ₽</w:t>
+              <w:t xml:space="preserve">100 000 000 сум</w:t>
             </w:r>
           </w:p>
         </w:tc>
@@ -2647,7 +2647,7 @@
                 <w:sz w:val="20"/>
                 <w:szCs w:val="20"/>
               </w:rPr>
-              <w:t xml:space="preserve">4 500 000 ₽</w:t>
+              <w:t xml:space="preserve">550 000 000 сум</w:t>
             </w:r>
           </w:p>
         </w:tc>
@@ -2783,7 +2783,7 @@
                 <w:sz w:val="20"/>
                 <w:szCs w:val="20"/>
               </w:rPr>
-              <w:t xml:space="preserve">2 700 000 ₽ (60%)</w:t>
+              <w:t xml:space="preserve">330 000 000 сум (60%)</w:t>
             </w:r>
           </w:p>
         </w:tc>
@@ -2839,7 +2839,7 @@
                 <w:sz w:val="20"/>
                 <w:szCs w:val="20"/>
               </w:rPr>
-              <w:t xml:space="preserve">1 800 000 ₽ (40%)</w:t>
+              <w:t xml:space="preserve">220 000 000 сум (40%)</w:t>
             </w:r>
           </w:p>
         </w:tc>
@@ -2978,7 +2978,7 @@
                 <w:sz w:val="20"/>
                 <w:szCs w:val="20"/>
               </w:rPr>
-              <w:t xml:space="preserve">420 000 ₽</w:t>
+              <w:t xml:space="preserve">36 000 000 сум</w:t>
             </w:r>
           </w:p>
         </w:tc>
@@ -3034,7 +3034,7 @@
                 <w:sz w:val="20"/>
                 <w:szCs w:val="20"/>
               </w:rPr>
-              <w:t xml:space="preserve">150 000 ₽</w:t>
+              <w:t xml:space="preserve">24 000 000 сум</w:t>
             </w:r>
           </w:p>
         </w:tc>
@@ -3062,7 +3062,7 @@
                 <w:sz w:val="20"/>
                 <w:szCs w:val="20"/>
               </w:rPr>
-              <w:t xml:space="preserve">Реклама и соцсети</w:t>
+              <w:t xml:space="preserve">Реклама: Instagram, Telegram, блогеры</w:t>
             </w:r>
           </w:p>
         </w:tc>
@@ -3088,7 +3088,7 @@
                 <w:sz w:val="20"/>
                 <w:szCs w:val="20"/>
               </w:rPr>
-              <w:t xml:space="preserve">50 000 ₽</w:t>
+              <w:t xml:space="preserve">6 000 000 сум</w:t>
             </w:r>
           </w:p>
         </w:tc>
@@ -3144,7 +3144,7 @@
                 <w:sz w:val="20"/>
                 <w:szCs w:val="20"/>
               </w:rPr>
-              <w:t xml:space="preserve">45 000 ₽</w:t>
+              <w:t xml:space="preserve">5 000 000 сум</w:t>
             </w:r>
           </w:p>
         </w:tc>
@@ -3198,7 +3198,7 @@
                 <w:sz w:val="20"/>
                 <w:szCs w:val="20"/>
               </w:rPr>
-              <w:t xml:space="preserve">40 000 ₽</w:t>
+              <w:t xml:space="preserve">5 000 000 сум</w:t>
             </w:r>
           </w:p>
         </w:tc>
@@ -3254,7 +3254,7 @@
                 <w:sz w:val="20"/>
                 <w:szCs w:val="20"/>
               </w:rPr>
-              <w:t xml:space="preserve">35 000 ₽</w:t>
+              <w:t xml:space="preserve">4 000 000 сум</w:t>
             </w:r>
           </w:p>
         </w:tc>
@@ -3308,7 +3308,7 @@
                 <w:sz w:val="20"/>
                 <w:szCs w:val="20"/>
               </w:rPr>
-              <w:t xml:space="preserve">25 000 ₽</w:t>
+              <w:t xml:space="preserve">4 000 000 сум</w:t>
             </w:r>
           </w:p>
         </w:tc>
@@ -3364,7 +3364,7 @@
                 <w:sz w:val="20"/>
                 <w:szCs w:val="20"/>
               </w:rPr>
-              <w:t xml:space="preserve">765 000 ₽</w:t>
+              <w:t xml:space="preserve">84 000 000 сум</w:t>
             </w:r>
           </w:p>
         </w:tc>
@@ -3375,7 +3375,7 @@
         <w:spacing w:after="120" w:before="120"/>
       </w:pPr>
       <w:r>
-        <w:t xml:space="preserve">Плюс переменные расходы: продукты, мерч и упаковка — 18% выручки, налог УСН «доходы» — 6% выручки. Итого 24%.</w:t>
+        <w:t xml:space="preserve">Плюс переменные расходы: продукты, мерч и упаковка — 18% выручки, налоги — около 6% выручки (упрощённая оценка). Итого 24%.</w:t>
       </w:r>
     </w:p>
     <w:p>
@@ -3396,7 +3396,7 @@
         <w:spacing w:after="80" w:line="280"/>
       </w:pPr>
       <w:r>
-        <w:t xml:space="preserve">Средний чек = 500 + 380 + 70 = </w:t>
+        <w:t xml:space="preserve">Средний чек = 50 000 + 42 000 + 8 000 = </w:t>
       </w:r>
       <w:r>
         <w:rPr>
@@ -3404,7 +3404,7 @@
           <w:bCs/>
           <w:color w:val="D9467A"/>
         </w:rPr>
-        <w:t xml:space="preserve">950 ₽</w:t>
+        <w:t xml:space="preserve">100 000 сум</w:t>
       </w:r>
     </w:p>
     <w:p>
@@ -3417,7 +3417,7 @@
         <w:spacing w:after="80" w:line="280"/>
       </w:pPr>
       <w:r>
-        <w:t xml:space="preserve">С гостя остаётся = 950 × (1 − 0,24) ≈ </w:t>
+        <w:t xml:space="preserve">С гостя остаётся = 100 000 × (1 − 0,24) = </w:t>
       </w:r>
       <w:r>
         <w:rPr>
@@ -3425,7 +3425,7 @@
           <w:bCs/>
           <w:color w:val="D9467A"/>
         </w:rPr>
-        <w:t xml:space="preserve">722 ₽</w:t>
+        <w:t xml:space="preserve">76 000 сум</w:t>
       </w:r>
     </w:p>
     <w:p>
@@ -3438,7 +3438,7 @@
         <w:spacing w:after="80" w:line="280"/>
       </w:pPr>
       <w:r>
-        <w:t xml:space="preserve">Безубыточность = 765 000 ÷ 722 ÷ 30 дней ≈ 35,3 → </w:t>
+        <w:t xml:space="preserve">Безубыточность = 84 000 000 ÷ 76 000 ÷ 30 дней ≈ 36,8 → </w:t>
       </w:r>
       <w:r>
         <w:rPr>
@@ -3446,7 +3446,7 @@
           <w:bCs/>
           <w:color w:val="D9467A"/>
         </w:rPr>
-        <w:t xml:space="preserve">36 гостей в день</w:t>
+        <w:t xml:space="preserve">37 гостей в день</w:t>
       </w:r>
     </w:p>
     <w:p>
@@ -3459,7 +3459,7 @@
         <w:spacing w:after="80" w:line="280"/>
       </w:pPr>
       <w:r>
-        <w:t xml:space="preserve">Прибыль за месяц = гостей в день × 30 × 722 − 765 000</w:t>
+        <w:t xml:space="preserve">Прибыль за месяц = гостей в день × 30 × 76 000 − 84 000 000</w:t>
       </w:r>
     </w:p>
     <w:p>
@@ -3472,7 +3472,7 @@
         <w:spacing w:after="80" w:line="280"/>
       </w:pPr>
       <w:r>
-        <w:t xml:space="preserve">Окупаемость — месяц, когда сумма прибыли с начала работы превысила вложения 4 500 000 ₽</w:t>
+        <w:t xml:space="preserve">Окупаемость — месяц, когда сумма прибыли с начала работы превысила вложения 550 000 000 сум</w:t>
       </w:r>
     </w:p>
     <w:p>
@@ -3584,7 +3584,7 @@
                 <w:sz w:val="20"/>
                 <w:szCs w:val="20"/>
               </w:rPr>
-              <w:t xml:space="preserve">Выручка</w:t>
+              <w:t xml:space="preserve">Выручка, млн</w:t>
             </w:r>
           </w:p>
         </w:tc>
@@ -3611,7 +3611,7 @@
                 <w:sz w:val="20"/>
                 <w:szCs w:val="20"/>
               </w:rPr>
-              <w:t xml:space="preserve">Прибыль</w:t>
+              <w:t xml:space="preserve">Прибыль, млн</w:t>
             </w:r>
           </w:p>
         </w:tc>
@@ -3638,7 +3638,7 @@
                 <w:sz w:val="20"/>
                 <w:szCs w:val="20"/>
               </w:rPr>
-              <w:t xml:space="preserve">Накоплено</w:t>
+              <w:t xml:space="preserve">Накоплено, млн</w:t>
             </w:r>
           </w:p>
         </w:tc>
@@ -3718,7 +3718,7 @@
                 <w:sz w:val="20"/>
                 <w:szCs w:val="20"/>
               </w:rPr>
-              <w:t xml:space="preserve">570 000 ₽</w:t>
+              <w:t xml:space="preserve">60</w:t>
             </w:r>
           </w:p>
         </w:tc>
@@ -3744,7 +3744,7 @@
                 <w:sz w:val="20"/>
                 <w:szCs w:val="20"/>
               </w:rPr>
-              <w:t xml:space="preserve">-331 800 ₽</w:t>
+              <w:t xml:space="preserve">-38,4</w:t>
             </w:r>
           </w:p>
         </w:tc>
@@ -3770,7 +3770,7 @@
                 <w:sz w:val="20"/>
                 <w:szCs w:val="20"/>
               </w:rPr>
-              <w:t xml:space="preserve">-4 831 800 ₽</w:t>
+              <w:t xml:space="preserve">-588,4</w:t>
             </w:r>
           </w:p>
         </w:tc>
@@ -3853,7 +3853,7 @@
                 <w:sz w:val="20"/>
                 <w:szCs w:val="20"/>
               </w:rPr>
-              <w:t xml:space="preserve">741 000 ₽</w:t>
+              <w:t xml:space="preserve">78</w:t>
             </w:r>
           </w:p>
         </w:tc>
@@ -3880,7 +3880,7 @@
                 <w:sz w:val="20"/>
                 <w:szCs w:val="20"/>
               </w:rPr>
-              <w:t xml:space="preserve">-201 840 ₽</w:t>
+              <w:t xml:space="preserve">-24,7</w:t>
             </w:r>
           </w:p>
         </w:tc>
@@ -3907,7 +3907,7 @@
                 <w:sz w:val="20"/>
                 <w:szCs w:val="20"/>
               </w:rPr>
-              <w:t xml:space="preserve">-5 033 640 ₽</w:t>
+              <w:t xml:space="preserve">-613,1</w:t>
             </w:r>
           </w:p>
         </w:tc>
@@ -3987,7 +3987,7 @@
                 <w:sz w:val="20"/>
                 <w:szCs w:val="20"/>
               </w:rPr>
-              <w:t xml:space="preserve">912 000 ₽</w:t>
+              <w:t xml:space="preserve">96</w:t>
             </w:r>
           </w:p>
         </w:tc>
@@ -4013,7 +4013,7 @@
                 <w:sz w:val="20"/>
                 <w:szCs w:val="20"/>
               </w:rPr>
-              <w:t xml:space="preserve">-71 880 ₽</w:t>
+              <w:t xml:space="preserve">-11</w:t>
             </w:r>
           </w:p>
         </w:tc>
@@ -4039,7 +4039,7 @@
                 <w:sz w:val="20"/>
                 <w:szCs w:val="20"/>
               </w:rPr>
-              <w:t xml:space="preserve">-5 105 520 ₽</w:t>
+              <w:t xml:space="preserve">-624,2</w:t>
             </w:r>
           </w:p>
         </w:tc>
@@ -4122,7 +4122,7 @@
                 <w:sz w:val="20"/>
                 <w:szCs w:val="20"/>
               </w:rPr>
-              <w:t xml:space="preserve">1 054 500 ₽</w:t>
+              <w:t xml:space="preserve">111</w:t>
             </w:r>
           </w:p>
         </w:tc>
@@ -4149,7 +4149,7 @@
                 <w:sz w:val="20"/>
                 <w:szCs w:val="20"/>
               </w:rPr>
-              <w:t xml:space="preserve">36 420 ₽</w:t>
+              <w:t xml:space="preserve">0,4</w:t>
             </w:r>
           </w:p>
         </w:tc>
@@ -4176,7 +4176,7 @@
                 <w:sz w:val="20"/>
                 <w:szCs w:val="20"/>
               </w:rPr>
-              <w:t xml:space="preserve">-5 069 100 ₽</w:t>
+              <w:t xml:space="preserve">-623,8</w:t>
             </w:r>
           </w:p>
         </w:tc>
@@ -4256,7 +4256,7 @@
                 <w:sz w:val="20"/>
                 <w:szCs w:val="20"/>
               </w:rPr>
-              <w:t xml:space="preserve">1 197 000 ₽</w:t>
+              <w:t xml:space="preserve">126</w:t>
             </w:r>
           </w:p>
         </w:tc>
@@ -4282,7 +4282,7 @@
                 <w:sz w:val="20"/>
                 <w:szCs w:val="20"/>
               </w:rPr>
-              <w:t xml:space="preserve">144 720 ₽</w:t>
+              <w:t xml:space="preserve">11,8</w:t>
             </w:r>
           </w:p>
         </w:tc>
@@ -4308,7 +4308,7 @@
                 <w:sz w:val="20"/>
                 <w:szCs w:val="20"/>
               </w:rPr>
-              <w:t xml:space="preserve">-4 924 380 ₽</w:t>
+              <w:t xml:space="preserve">-612</w:t>
             </w:r>
           </w:p>
         </w:tc>
@@ -4391,7 +4391,7 @@
                 <w:sz w:val="20"/>
                 <w:szCs w:val="20"/>
               </w:rPr>
-              <w:t xml:space="preserve">1 311 000 ₽</w:t>
+              <w:t xml:space="preserve">138</w:t>
             </w:r>
           </w:p>
         </w:tc>
@@ -4418,7 +4418,7 @@
                 <w:sz w:val="20"/>
                 <w:szCs w:val="20"/>
               </w:rPr>
-              <w:t xml:space="preserve">231 360 ₽</w:t>
+              <w:t xml:space="preserve">20,9</w:t>
             </w:r>
           </w:p>
         </w:tc>
@@ -4445,7 +4445,7 @@
                 <w:sz w:val="20"/>
                 <w:szCs w:val="20"/>
               </w:rPr>
-              <w:t xml:space="preserve">-4 693 020 ₽</w:t>
+              <w:t xml:space="preserve">-591,2</w:t>
             </w:r>
           </w:p>
         </w:tc>
@@ -4525,7 +4525,7 @@
                 <w:sz w:val="20"/>
                 <w:szCs w:val="20"/>
               </w:rPr>
-              <w:t xml:space="preserve">1 425 000 ₽</w:t>
+              <w:t xml:space="preserve">150</w:t>
             </w:r>
           </w:p>
         </w:tc>
@@ -4551,7 +4551,7 @@
                 <w:sz w:val="20"/>
                 <w:szCs w:val="20"/>
               </w:rPr>
-              <w:t xml:space="preserve">318 000 ₽</w:t>
+              <w:t xml:space="preserve">30</w:t>
             </w:r>
           </w:p>
         </w:tc>
@@ -4577,7 +4577,7 @@
                 <w:sz w:val="20"/>
                 <w:szCs w:val="20"/>
               </w:rPr>
-              <w:t xml:space="preserve">-4 375 020 ₽</w:t>
+              <w:t xml:space="preserve">-561,2</w:t>
             </w:r>
           </w:p>
         </w:tc>
@@ -4660,7 +4660,7 @@
                 <w:sz w:val="20"/>
                 <w:szCs w:val="20"/>
               </w:rPr>
-              <w:t xml:space="preserve">1 482 000 ₽</w:t>
+              <w:t xml:space="preserve">156</w:t>
             </w:r>
           </w:p>
         </w:tc>
@@ -4687,7 +4687,7 @@
                 <w:sz w:val="20"/>
                 <w:szCs w:val="20"/>
               </w:rPr>
-              <w:t xml:space="preserve">361 320 ₽</w:t>
+              <w:t xml:space="preserve">34,6</w:t>
             </w:r>
           </w:p>
         </w:tc>
@@ -4714,7 +4714,7 @@
                 <w:sz w:val="20"/>
                 <w:szCs w:val="20"/>
               </w:rPr>
-              <w:t xml:space="preserve">-4 013 700 ₽</w:t>
+              <w:t xml:space="preserve">-526,6</w:t>
             </w:r>
           </w:p>
         </w:tc>
@@ -4794,7 +4794,7 @@
                 <w:sz w:val="20"/>
                 <w:szCs w:val="20"/>
               </w:rPr>
-              <w:t xml:space="preserve">1 539 000 ₽</w:t>
+              <w:t xml:space="preserve">162</w:t>
             </w:r>
           </w:p>
         </w:tc>
@@ -4820,7 +4820,7 @@
                 <w:sz w:val="20"/>
                 <w:szCs w:val="20"/>
               </w:rPr>
-              <w:t xml:space="preserve">404 640 ₽</w:t>
+              <w:t xml:space="preserve">39,1</w:t>
             </w:r>
           </w:p>
         </w:tc>
@@ -4846,7 +4846,7 @@
                 <w:sz w:val="20"/>
                 <w:szCs w:val="20"/>
               </w:rPr>
-              <w:t xml:space="preserve">-3 609 060 ₽</w:t>
+              <w:t xml:space="preserve">-487,5</w:t>
             </w:r>
           </w:p>
         </w:tc>
@@ -4929,7 +4929,7 @@
                 <w:sz w:val="20"/>
                 <w:szCs w:val="20"/>
               </w:rPr>
-              <w:t xml:space="preserve">1 567 500 ₽</w:t>
+              <w:t xml:space="preserve">165</w:t>
             </w:r>
           </w:p>
         </w:tc>
@@ -4956,7 +4956,7 @@
                 <w:sz w:val="20"/>
                 <w:szCs w:val="20"/>
               </w:rPr>
-              <w:t xml:space="preserve">426 300 ₽</w:t>
+              <w:t xml:space="preserve">41,4</w:t>
             </w:r>
           </w:p>
         </w:tc>
@@ -4983,7 +4983,7 @@
                 <w:sz w:val="20"/>
                 <w:szCs w:val="20"/>
               </w:rPr>
-              <w:t xml:space="preserve">-3 182 760 ₽</w:t>
+              <w:t xml:space="preserve">-446,1</w:t>
             </w:r>
           </w:p>
         </w:tc>
@@ -5063,7 +5063,7 @@
                 <w:sz w:val="20"/>
                 <w:szCs w:val="20"/>
               </w:rPr>
-              <w:t xml:space="preserve">1 596 000 ₽</w:t>
+              <w:t xml:space="preserve">168</w:t>
             </w:r>
           </w:p>
         </w:tc>
@@ -5089,7 +5089,7 @@
                 <w:sz w:val="20"/>
                 <w:szCs w:val="20"/>
               </w:rPr>
-              <w:t xml:space="preserve">447 960 ₽</w:t>
+              <w:t xml:space="preserve">43,7</w:t>
             </w:r>
           </w:p>
         </w:tc>
@@ -5115,7 +5115,7 @@
                 <w:sz w:val="20"/>
                 <w:szCs w:val="20"/>
               </w:rPr>
-              <w:t xml:space="preserve">-2 734 800 ₽</w:t>
+              <w:t xml:space="preserve">-402,4</w:t>
             </w:r>
           </w:p>
         </w:tc>
@@ -5198,7 +5198,7 @@
                 <w:sz w:val="20"/>
                 <w:szCs w:val="20"/>
               </w:rPr>
-              <w:t xml:space="preserve">1 624 500 ₽</w:t>
+              <w:t xml:space="preserve">171</w:t>
             </w:r>
           </w:p>
         </w:tc>
@@ -5225,7 +5225,7 @@
                 <w:sz w:val="20"/>
                 <w:szCs w:val="20"/>
               </w:rPr>
-              <w:t xml:space="preserve">469 620 ₽</w:t>
+              <w:t xml:space="preserve">46</w:t>
             </w:r>
           </w:p>
         </w:tc>
@@ -5252,7 +5252,7 @@
                 <w:sz w:val="20"/>
                 <w:szCs w:val="20"/>
               </w:rPr>
-              <w:t xml:space="preserve">-2 265 180 ₽</w:t>
+              <w:t xml:space="preserve">-356,4</w:t>
             </w:r>
           </w:p>
         </w:tc>
@@ -5332,7 +5332,7 @@
                 <w:sz w:val="20"/>
                 <w:szCs w:val="20"/>
               </w:rPr>
-              <w:t xml:space="preserve">1 710 000 ₽</w:t>
+              <w:t xml:space="preserve">180</w:t>
             </w:r>
           </w:p>
         </w:tc>
@@ -5358,7 +5358,7 @@
                 <w:sz w:val="20"/>
                 <w:szCs w:val="20"/>
               </w:rPr>
-              <w:t xml:space="preserve">534 600 ₽</w:t>
+              <w:t xml:space="preserve">52,8</w:t>
             </w:r>
           </w:p>
         </w:tc>
@@ -5384,7 +5384,7 @@
                 <w:sz w:val="20"/>
                 <w:szCs w:val="20"/>
               </w:rPr>
-              <w:t xml:space="preserve">-1 730 580 ₽</w:t>
+              <w:t xml:space="preserve">-303,6</w:t>
             </w:r>
           </w:p>
         </w:tc>
@@ -5467,7 +5467,7 @@
                 <w:sz w:val="20"/>
                 <w:szCs w:val="20"/>
               </w:rPr>
-              <w:t xml:space="preserve">1 710 000 ₽</w:t>
+              <w:t xml:space="preserve">180</w:t>
             </w:r>
           </w:p>
         </w:tc>
@@ -5494,7 +5494,7 @@
                 <w:sz w:val="20"/>
                 <w:szCs w:val="20"/>
               </w:rPr>
-              <w:t xml:space="preserve">534 600 ₽</w:t>
+              <w:t xml:space="preserve">52,8</w:t>
             </w:r>
           </w:p>
         </w:tc>
@@ -5521,7 +5521,7 @@
                 <w:sz w:val="20"/>
                 <w:szCs w:val="20"/>
               </w:rPr>
-              <w:t xml:space="preserve">-1 195 980 ₽</w:t>
+              <w:t xml:space="preserve">-250,8</w:t>
             </w:r>
           </w:p>
         </w:tc>
@@ -5601,7 +5601,7 @@
                 <w:sz w:val="20"/>
                 <w:szCs w:val="20"/>
               </w:rPr>
-              <w:t xml:space="preserve">1 710 000 ₽</w:t>
+              <w:t xml:space="preserve">180</w:t>
             </w:r>
           </w:p>
         </w:tc>
@@ -5627,7 +5627,7 @@
                 <w:sz w:val="20"/>
                 <w:szCs w:val="20"/>
               </w:rPr>
-              <w:t xml:space="preserve">534 600 ₽</w:t>
+              <w:t xml:space="preserve">52,8</w:t>
             </w:r>
           </w:p>
         </w:tc>
@@ -5653,7 +5653,7 @@
                 <w:sz w:val="20"/>
                 <w:szCs w:val="20"/>
               </w:rPr>
-              <w:t xml:space="preserve">-661 380 ₽</w:t>
+              <w:t xml:space="preserve">-198</w:t>
             </w:r>
           </w:p>
         </w:tc>
@@ -5736,7 +5736,7 @@
                 <w:sz w:val="20"/>
                 <w:szCs w:val="20"/>
               </w:rPr>
-              <w:t xml:space="preserve">1 710 000 ₽</w:t>
+              <w:t xml:space="preserve">180</w:t>
             </w:r>
           </w:p>
         </w:tc>
@@ -5763,7 +5763,7 @@
                 <w:sz w:val="20"/>
                 <w:szCs w:val="20"/>
               </w:rPr>
-              <w:t xml:space="preserve">534 600 ₽</w:t>
+              <w:t xml:space="preserve">52,8</w:t>
             </w:r>
           </w:p>
         </w:tc>
@@ -5790,7 +5790,7 @@
                 <w:sz w:val="20"/>
                 <w:szCs w:val="20"/>
               </w:rPr>
-              <w:t xml:space="preserve">-126 780 ₽</w:t>
+              <w:t xml:space="preserve">-145,2</w:t>
             </w:r>
           </w:p>
         </w:tc>
@@ -5870,7 +5870,7 @@
                 <w:sz w:val="20"/>
                 <w:szCs w:val="20"/>
               </w:rPr>
-              <w:t xml:space="preserve">1 710 000 ₽</w:t>
+              <w:t xml:space="preserve">180</w:t>
             </w:r>
           </w:p>
         </w:tc>
@@ -5896,7 +5896,7 @@
                 <w:sz w:val="20"/>
                 <w:szCs w:val="20"/>
               </w:rPr>
-              <w:t xml:space="preserve">534 600 ₽</w:t>
+              <w:t xml:space="preserve">52,8</w:t>
             </w:r>
           </w:p>
         </w:tc>
@@ -5922,7 +5922,276 @@
                 <w:sz w:val="20"/>
                 <w:szCs w:val="20"/>
               </w:rPr>
-              <w:t xml:space="preserve">407 820 ₽</w:t>
+              <w:t xml:space="preserve">-92,4</w:t>
+            </w:r>
+          </w:p>
+        </w:tc>
+      </w:tr>
+      <w:tr>
+        <w:tc>
+          <w:tcPr>
+            <w:tcW w:type="dxa" w:w="1900"/>
+            <w:shd w:fill="FFF7FA" w:color="auto" w:val="clear"/>
+            <w:tcMar>
+              <w:top w:type="dxa" w:w="60"/>
+              <w:left w:type="dxa" w:w="120"/>
+              <w:bottom w:type="dxa" w:w="60"/>
+              <w:right w:type="dxa" w:w="120"/>
+            </w:tcMar>
+          </w:tcPr>
+          <w:p>
+            <w:pPr>
+              <w:jc w:val="left"/>
+            </w:pPr>
+            <w:r>
+              <w:rPr>
+                <w:b w:val="false"/>
+                <w:bCs w:val="false"/>
+                <w:color w:val="5B3A3A"/>
+                <w:sz w:val="20"/>
+                <w:szCs w:val="20"/>
+              </w:rPr>
+              <w:t xml:space="preserve">18. июн 2028</w:t>
+            </w:r>
+          </w:p>
+        </w:tc>
+        <w:tc>
+          <w:tcPr>
+            <w:tcW w:type="dxa" w:w="1400"/>
+            <w:shd w:fill="FFF7FA" w:color="auto" w:val="clear"/>
+            <w:tcMar>
+              <w:top w:type="dxa" w:w="60"/>
+              <w:left w:type="dxa" w:w="120"/>
+              <w:bottom w:type="dxa" w:w="60"/>
+              <w:right w:type="dxa" w:w="120"/>
+            </w:tcMar>
+          </w:tcPr>
+          <w:p>
+            <w:pPr>
+              <w:jc w:val="right"/>
+            </w:pPr>
+            <w:r>
+              <w:rPr>
+                <w:b w:val="false"/>
+                <w:bCs w:val="false"/>
+                <w:color w:val="5B3A3A"/>
+                <w:sz w:val="20"/>
+                <w:szCs w:val="20"/>
+              </w:rPr>
+              <w:t xml:space="preserve">60</w:t>
+            </w:r>
+          </w:p>
+        </w:tc>
+        <w:tc>
+          <w:tcPr>
+            <w:tcW w:type="dxa" w:w="1900"/>
+            <w:shd w:fill="FFF7FA" w:color="auto" w:val="clear"/>
+            <w:tcMar>
+              <w:top w:type="dxa" w:w="60"/>
+              <w:left w:type="dxa" w:w="120"/>
+              <w:bottom w:type="dxa" w:w="60"/>
+              <w:right w:type="dxa" w:w="120"/>
+            </w:tcMar>
+          </w:tcPr>
+          <w:p>
+            <w:pPr>
+              <w:jc w:val="right"/>
+            </w:pPr>
+            <w:r>
+              <w:rPr>
+                <w:b w:val="false"/>
+                <w:bCs w:val="false"/>
+                <w:color w:val="5B3A3A"/>
+                <w:sz w:val="20"/>
+                <w:szCs w:val="20"/>
+              </w:rPr>
+              <w:t xml:space="preserve">180</w:t>
+            </w:r>
+          </w:p>
+        </w:tc>
+        <w:tc>
+          <w:tcPr>
+            <w:tcW w:type="dxa" w:w="1900"/>
+            <w:shd w:fill="FFF7FA" w:color="auto" w:val="clear"/>
+            <w:tcMar>
+              <w:top w:type="dxa" w:w="60"/>
+              <w:left w:type="dxa" w:w="120"/>
+              <w:bottom w:type="dxa" w:w="60"/>
+              <w:right w:type="dxa" w:w="120"/>
+            </w:tcMar>
+          </w:tcPr>
+          <w:p>
+            <w:pPr>
+              <w:jc w:val="right"/>
+            </w:pPr>
+            <w:r>
+              <w:rPr>
+                <w:b w:val="false"/>
+                <w:bCs w:val="false"/>
+                <w:color w:val="5B3A3A"/>
+                <w:sz w:val="20"/>
+                <w:szCs w:val="20"/>
+              </w:rPr>
+              <w:t xml:space="preserve">52,8</w:t>
+            </w:r>
+          </w:p>
+        </w:tc>
+        <w:tc>
+          <w:tcPr>
+            <w:tcW w:type="dxa" w:w="1926"/>
+            <w:shd w:fill="FFF7FA" w:color="auto" w:val="clear"/>
+            <w:tcMar>
+              <w:top w:type="dxa" w:w="60"/>
+              <w:left w:type="dxa" w:w="120"/>
+              <w:bottom w:type="dxa" w:w="60"/>
+              <w:right w:type="dxa" w:w="120"/>
+            </w:tcMar>
+          </w:tcPr>
+          <w:p>
+            <w:pPr>
+              <w:jc w:val="right"/>
+            </w:pPr>
+            <w:r>
+              <w:rPr>
+                <w:b w:val="false"/>
+                <w:bCs w:val="false"/>
+                <w:color w:val="5B3A3A"/>
+                <w:sz w:val="20"/>
+                <w:szCs w:val="20"/>
+              </w:rPr>
+              <w:t xml:space="preserve">-39,6</w:t>
+            </w:r>
+          </w:p>
+        </w:tc>
+      </w:tr>
+      <w:tr>
+        <w:tc>
+          <w:tcPr>
+            <w:tcW w:type="dxa" w:w="1900"/>
+            <w:tcMar>
+              <w:top w:type="dxa" w:w="60"/>
+              <w:left w:type="dxa" w:w="120"/>
+              <w:bottom w:type="dxa" w:w="60"/>
+              <w:right w:type="dxa" w:w="120"/>
+            </w:tcMar>
+          </w:tcPr>
+          <w:p>
+            <w:pPr>
+              <w:jc w:val="left"/>
+            </w:pPr>
+            <w:r>
+              <w:rPr>
+                <w:b w:val="false"/>
+                <w:bCs w:val="false"/>
+                <w:color w:val="5B3A3A"/>
+                <w:sz w:val="20"/>
+                <w:szCs w:val="20"/>
+              </w:rPr>
+              <w:t xml:space="preserve">19. июл 2028</w:t>
+            </w:r>
+          </w:p>
+        </w:tc>
+        <w:tc>
+          <w:tcPr>
+            <w:tcW w:type="dxa" w:w="1400"/>
+            <w:tcMar>
+              <w:top w:type="dxa" w:w="60"/>
+              <w:left w:type="dxa" w:w="120"/>
+              <w:bottom w:type="dxa" w:w="60"/>
+              <w:right w:type="dxa" w:w="120"/>
+            </w:tcMar>
+          </w:tcPr>
+          <w:p>
+            <w:pPr>
+              <w:jc w:val="right"/>
+            </w:pPr>
+            <w:r>
+              <w:rPr>
+                <w:b w:val="false"/>
+                <w:bCs w:val="false"/>
+                <w:color w:val="5B3A3A"/>
+                <w:sz w:val="20"/>
+                <w:szCs w:val="20"/>
+              </w:rPr>
+              <w:t xml:space="preserve">60</w:t>
+            </w:r>
+          </w:p>
+        </w:tc>
+        <w:tc>
+          <w:tcPr>
+            <w:tcW w:type="dxa" w:w="1900"/>
+            <w:tcMar>
+              <w:top w:type="dxa" w:w="60"/>
+              <w:left w:type="dxa" w:w="120"/>
+              <w:bottom w:type="dxa" w:w="60"/>
+              <w:right w:type="dxa" w:w="120"/>
+            </w:tcMar>
+          </w:tcPr>
+          <w:p>
+            <w:pPr>
+              <w:jc w:val="right"/>
+            </w:pPr>
+            <w:r>
+              <w:rPr>
+                <w:b w:val="false"/>
+                <w:bCs w:val="false"/>
+                <w:color w:val="5B3A3A"/>
+                <w:sz w:val="20"/>
+                <w:szCs w:val="20"/>
+              </w:rPr>
+              <w:t xml:space="preserve">180</w:t>
+            </w:r>
+          </w:p>
+        </w:tc>
+        <w:tc>
+          <w:tcPr>
+            <w:tcW w:type="dxa" w:w="1900"/>
+            <w:tcMar>
+              <w:top w:type="dxa" w:w="60"/>
+              <w:left w:type="dxa" w:w="120"/>
+              <w:bottom w:type="dxa" w:w="60"/>
+              <w:right w:type="dxa" w:w="120"/>
+            </w:tcMar>
+          </w:tcPr>
+          <w:p>
+            <w:pPr>
+              <w:jc w:val="right"/>
+            </w:pPr>
+            <w:r>
+              <w:rPr>
+                <w:b w:val="false"/>
+                <w:bCs w:val="false"/>
+                <w:color w:val="5B3A3A"/>
+                <w:sz w:val="20"/>
+                <w:szCs w:val="20"/>
+              </w:rPr>
+              <w:t xml:space="preserve">52,8</w:t>
+            </w:r>
+          </w:p>
+        </w:tc>
+        <w:tc>
+          <w:tcPr>
+            <w:tcW w:type="dxa" w:w="1926"/>
+            <w:tcMar>
+              <w:top w:type="dxa" w:w="60"/>
+              <w:left w:type="dxa" w:w="120"/>
+              <w:bottom w:type="dxa" w:w="60"/>
+              <w:right w:type="dxa" w:w="120"/>
+            </w:tcMar>
+          </w:tcPr>
+          <w:p>
+            <w:pPr>
+              <w:jc w:val="right"/>
+            </w:pPr>
+            <w:r>
+              <w:rPr>
+                <w:b w:val="false"/>
+                <w:bCs w:val="false"/>
+                <w:color w:val="5B3A3A"/>
+                <w:sz w:val="20"/>
+                <w:szCs w:val="20"/>
+              </w:rPr>
+              <w:t xml:space="preserve">13,2</w:t>
             </w:r>
           </w:p>
         </w:tc>
@@ -5938,7 +6207,7 @@
           <w:sz w:val="20"/>
           <w:szCs w:val="20"/>
         </w:rPr>
-        <w:t xml:space="preserve">«Накоплено» начинается с −4 500 000 ₽ (вложения). Когда число становится положительным — кафе окупилось.</w:t>
+        <w:t xml:space="preserve">Суммы в миллионах сум. «Накоплено» начинается с −550 (вложения). Когда число становится положительным — кафе окупилось.</w:t>
       </w:r>
     </w:p>
     <w:p>
@@ -5975,7 +6244,7 @@
         <w:rPr>
           <w:color w:val="5B3A3A"/>
         </w:rPr>
-        <w:t xml:space="preserve">Точка безубыточности — 36 гостей в день, это всего около 14% загрузки зала. Если гостей будет на 20% меньше плана, первая прибыль придёт на 6-й месяц, а окупаемость — примерно через 2,5 года (29 месяцев). Убыток первых месяцев тогда будет больше подушки примерно на 270 тыс. — покроем, сократив рекламу и часы работы в будни, или добавим из собственных средств.</w:t>
+        <w:t xml:space="preserve">Точка безубыточности — 37 гостей в день, это всего около 14% загрузки зала. Если гостей будет на 20% меньше плана, первая прибыль придёт на 6-й месяц, а окупаемость — примерно через 36 месяцев (3 года). Убыток первых месяцев тогда будет больше подушки примерно на 30 млн — покроем, сократив рекламу и часы работы в будни, или добавим из собственных средств.</w:t>
       </w:r>
     </w:p>
     <w:p>
@@ -5988,7 +6257,7 @@
           <w:bCs/>
           <w:color w:val="D9467A"/>
         </w:rPr>
-        <w:t xml:space="preserve">— Откуда средний чек 950 ₽?</w:t>
+        <w:t xml:space="preserve">— Откуда средний чек 100 000 сум?</w:t>
       </w:r>
     </w:p>
     <w:p>
@@ -5999,7 +6268,7 @@
         <w:rPr>
           <w:color w:val="5B3A3A"/>
         </w:rPr>
-        <w:t xml:space="preserve">500 ₽ — время с котиками (400 ₽ в час × 1,25 часа), 380 ₽ — кофе и десерт, 70 ₽ — мерч: покупает не каждый, но примерно каждый четвёртый гость берёт стикеры или брелок примерно за 280 ₽.</w:t>
+        <w:t xml:space="preserve">50 000 сум — время с котиками (40 000 сум в час × 1,25 часа), 42 000 сум — кофе и десерт, 8 000 сум — мерч: покупает не каждый, но примерно каждый пятый гость берёт стикеры или брелок примерно за 40 000 сум.</w:t>
       </w:r>
     </w:p>
     <w:p>
@@ -6071,7 +6340,7 @@
         <w:rPr>
           <w:color w:val="5B3A3A"/>
         </w:rPr>
-        <w:t xml:space="preserve">Кредит — 1,8 млн ₽, то есть только 40% капитала. Платёж — около 67 тыс. ₽ в месяц, из них примерно 25 тыс. — проценты, они уже учтены в расходах. С 4-го месяца прибыль покрывает платёж, а в первые месяцы — подушка.</w:t>
+        <w:t xml:space="preserve">Кредит — 220 млн сум, то есть только 40% капитала (в расчёте — 24% годовых на 3 года). Платёж — около 8,6 млн сум в месяц, из них примерно 4 млн — проценты, они уже учтены в расходах. С 4-го месяца прибыль покрывает платёж, а в первые месяцы — подушка.</w:t>
       </w:r>
     </w:p>
     <w:p>
@@ -6095,7 +6364,7 @@
         <w:rPr>
           <w:color w:val="5B3A3A"/>
         </w:rPr>
-        <w:t xml:space="preserve">Мы работаем вместе с приютом. Если котика забирают домой — это и есть наша миссия, приют передаёт нам нового. Истории «котик нашёл дом» в соцсетях ещё и бесплатная реклама.</w:t>
+        <w:t xml:space="preserve">Мы работаем вместе с приютом. Если котика забирают домой — это и есть наша миссия, приют передаёт нам нового. Истории «котик нашёл дом» в Instagram и Telegram ещё и бесплатная реклама.</w:t>
       </w:r>
     </w:p>
     <w:p>
@@ -6143,7 +6412,7 @@
         <w:rPr>
           <w:color w:val="5B3A3A"/>
         </w:rPr>
-        <w:t xml:space="preserve">Расходы почти не меняются, а гостей становится больше: 60 в день вместо 20–57 в первый год. Выручка растёт до 20,5 млн ₽, прибыль — до 6,4 млн ₽.</w:t>
+        <w:t xml:space="preserve">Расходы почти не меняются, а гостей становится больше: 60 в день вместо 20–57 в первый год. Выручка растёт до 2,2 млрд сум, прибыль — до 634 млн сум.</w:t>
       </w:r>
     </w:p>
     <w:p>
@@ -6207,7 +6476,7 @@
         <w:rPr>
           <w:color w:val="5B3A3A"/>
         </w:rPr>
-        <w:t xml:space="preserve">4,5 млн = 1,8 ремонт + 0,95 запуск + 0,8 подушка + 0,7 кухня + 0,25 котики; 60/40.</w:t>
+        <w:t xml:space="preserve">550 млн = 220 млн ремонт + 115 млн запуск + 100 млн подушка + 90 млн кухня + 25 млн котики; 60/40.</w:t>
       </w:r>
     </w:p>
     <w:p>
@@ -6223,7 +6492,7 @@
         <w:rPr>
           <w:color w:val="5B3A3A"/>
         </w:rPr>
-        <w:t xml:space="preserve">765 тыс./мес: зарплата 420, аренда 150; плюс 24% от выручки.</w:t>
+        <w:t xml:space="preserve">84 млн сум/мес: зарплата 36 млн, аренда 24 млн; плюс 24% от выручки.</w:t>
       </w:r>
     </w:p>
     <w:p>
@@ -6239,7 +6508,7 @@
         <w:rPr>
           <w:color w:val="5B3A3A"/>
         </w:rPr>
-        <w:t xml:space="preserve">чек 950 ₽ = 500 + 380 + 70; с гостя остаётся 722 ₽; безубыточность — 36 гостей/день.</w:t>
+        <w:t xml:space="preserve">чек 100 тыс. = 50 тыс. + 42 тыс. + 8 тыс.; с гостя остаётся 76 тыс.; безубыточность — 37 гостей/день.</w:t>
       </w:r>
     </w:p>
     <w:p>
@@ -6255,7 +6524,7 @@
         <w:rPr>
           <w:color w:val="5B3A3A"/>
         </w:rPr>
-        <w:t xml:space="preserve">убыток 3 мес. ≈ 605 тыс. (покрывает подушка); плюс с 4-го месяца; окупаемость — 17-й месяц.</w:t>
+        <w:t xml:space="preserve">убыток 3 мес. ≈ 74 млн (покрывает подушка); плюс с 4-го месяца; окупаемость — 19-й месяц.</w:t>
       </w:r>
     </w:p>
     <w:p>
@@ -6271,7 +6540,7 @@
         <w:rPr>
           <w:color w:val="5B3A3A"/>
         </w:rPr>
-        <w:t xml:space="preserve">4,5 млн → прибыль с 4-го месяца → окупаемость 17 мес. → 6,4 млн во 2-й год.</w:t>
+        <w:t xml:space="preserve">550 млн → прибыль с 4-го месяца → окупаемость 19 мес. → 634 млн во 2-й год.</w:t>
       </w:r>
     </w:p>
     <w:sectPr>

</xml_diff>